<commit_message>
Refresh repo docs and readiness status
</commit_message>
<xml_diff>
--- a/PROJECT_HANDOFF_2026-03-27.docx
+++ b/PROJECT_HANDOFF_2026-03-27.docx
@@ -108,6 +108,24 @@
         <w:t xml:space="preserve">- the app launched successfully and rendered the expected missing-backend setup gate instead of crashing</w:t>
       </w:r>
     </w:p>
+    <w:p>
+      <w:r>
+        <w:rPr>
+          <w:sz w:val="22"/>
+          <w:szCs w:val="22"/>
+        </w:rPr>
+        <w:t xml:space="preserve">- the workspace was then cleaned back to the managed / no-local-native-folder state so GitHub and `expo-doctor` stay clean</w:t>
+      </w:r>
+    </w:p>
+    <w:p>
+      <w:r>
+        <w:rPr>
+          <w:sz w:val="22"/>
+          <w:szCs w:val="22"/>
+        </w:rPr>
+        <w:t xml:space="preserve">- the local repo is now connected to GitHub at `https://github.com/moonlithe1983/sideroom`</w:t>
+      </w:r>
+    </w:p>
     <w:p/>
     <w:p>
       <w:r>
@@ -387,6 +405,24 @@
         <w:t xml:space="preserve">- Generated a local native `android/` folder and a native debug APK as part of that smoke test.</w:t>
       </w:r>
     </w:p>
+    <w:p>
+      <w:r>
+        <w:rPr>
+          <w:sz w:val="22"/>
+          <w:szCs w:val="22"/>
+        </w:rPr>
+        <w:t xml:space="preserve">- Removed the generated local `android/` and `.expo/` folders afterward so the tracked repo stays in a clean managed state.</w:t>
+      </w:r>
+    </w:p>
+    <w:p>
+      <w:r>
+        <w:rPr>
+          <w:sz w:val="22"/>
+          <w:szCs w:val="22"/>
+        </w:rPr>
+        <w:t xml:space="preserve">- Initialized the local Git repository, connected `origin`, and pushed `main` to GitHub.</w:t>
+      </w:r>
+    </w:p>
     <w:p/>
     <w:p>
       <w:r>
@@ -1536,25 +1572,25 @@
           <w:sz w:val="22"/>
           <w:szCs w:val="22"/>
         </w:rPr>
-        <w:t xml:space="preserve">- That folder is currently present locally.</w:t>
-      </w:r>
-    </w:p>
-    <w:p>
-      <w:r>
-        <w:rPr>
-          <w:sz w:val="22"/>
-          <w:szCs w:val="22"/>
-        </w:rPr>
-        <w:t xml:space="preserve">- The project is now in a "local native folder exists" state for this workspace.</w:t>
-      </w:r>
-    </w:p>
-    <w:p>
-      <w:r>
-        <w:rPr>
-          <w:sz w:val="22"/>
-          <w:szCs w:val="22"/>
-        </w:rPr>
-        <w:t xml:space="preserve">- `expo-doctor` warns that with native folders present, some `app.json` values are no longer auto-synced by EAS the way a pure no-native-folder CNG flow would be.</w:t>
+        <w:t xml:space="preserve">- That folder was intentionally removed after the smoke pass.</w:t>
+      </w:r>
+    </w:p>
+    <w:p>
+      <w:r>
+        <w:rPr>
+          <w:sz w:val="22"/>
+          <w:szCs w:val="22"/>
+        </w:rPr>
+        <w:t xml:space="preserve">- The workspace is currently back in the managed / no-local-native-folder state.</w:t>
+      </w:r>
+    </w:p>
+    <w:p>
+      <w:r>
+        <w:rPr>
+          <w:sz w:val="22"/>
+          <w:szCs w:val="22"/>
+        </w:rPr>
+        <w:t xml:space="preserve">- If native local debugging is needed again, rerun `npx expo run:android` and expect Expo to recreate `android/` locally.</w:t>
       </w:r>
     </w:p>
     <w:p/>
@@ -1584,6 +1620,25 @@
           <w:szCs w:val="22"/>
         </w:rPr>
         <w:t xml:space="preserve">  - `android/app/build/outputs/apk/debug/app-debug.apk`</w:t>
+      </w:r>
+    </w:p>
+    <w:p/>
+    <w:p>
+      <w:r>
+        <w:rPr>
+          <w:sz w:val="22"/>
+          <w:szCs w:val="22"/>
+        </w:rPr>
+        <w:t xml:space="preserve">That APK path is only available immediately after a local native build. It is not retained in the</w:t>
+      </w:r>
+    </w:p>
+    <w:p>
+      <w:r>
+        <w:rPr>
+          <w:sz w:val="22"/>
+          <w:szCs w:val="22"/>
+        </w:rPr>
+        <w:t xml:space="preserve">current cleaned workspace.</w:t>
       </w:r>
     </w:p>
     <w:p/>
@@ -1604,53 +1659,55 @@
           <w:sz w:val="22"/>
           <w:szCs w:val="22"/>
         </w:rPr>
-        <w:t xml:space="preserve">`npx expo-doctor` still reports two warnings:</w:t>
-      </w:r>
-    </w:p>
-    <w:p/>
-    <w:p>
-      <w:r>
-        <w:rPr>
-          <w:sz w:val="22"/>
-          <w:szCs w:val="22"/>
-        </w:rPr>
-        <w:t xml:space="preserve">1. It claims `.expo` is not ignored by Git.</w:t>
-      </w:r>
-    </w:p>
-    <w:p>
-      <w:r>
-        <w:rPr>
-          <w:sz w:val="22"/>
-          <w:szCs w:val="22"/>
-        </w:rPr>
-        <w:t xml:space="preserve">   - `.gitignore` already includes `.expo` and `.expo/`.</w:t>
-      </w:r>
-    </w:p>
-    <w:p>
-      <w:r>
-        <w:rPr>
-          <w:sz w:val="22"/>
-          <w:szCs w:val="22"/>
-        </w:rPr>
-        <w:t xml:space="preserve">   - In this Codex workspace there is also no visible `.git` directory, so treat this warning as suspicious / environment-specific rather than automatically assuming the ignore file is wrong.</w:t>
-      </w:r>
-    </w:p>
-    <w:p>
-      <w:r>
-        <w:rPr>
-          <w:sz w:val="22"/>
-          <w:szCs w:val="22"/>
-        </w:rPr>
-        <w:t xml:space="preserve">2. It warns that native config fields in `app.json` may not be auto-synced now that local native project folders exist.</w:t>
-      </w:r>
-    </w:p>
-    <w:p>
-      <w:r>
-        <w:rPr>
-          <w:sz w:val="22"/>
-          <w:szCs w:val="22"/>
-        </w:rPr>
-        <w:t xml:space="preserve">   - This is real and is the important warning to remember if continuing local native work.</w:t>
+        <w:t xml:space="preserve">`npx expo-doctor` now passes cleanly:</w:t>
+      </w:r>
+    </w:p>
+    <w:p/>
+    <w:p>
+      <w:r>
+        <w:rPr>
+          <w:sz w:val="22"/>
+          <w:szCs w:val="22"/>
+        </w:rPr>
+        <w:t xml:space="preserve">- `17/17` checks passed</w:t>
+      </w:r>
+    </w:p>
+    <w:p/>
+    <w:p>
+      <w:r>
+        <w:rPr>
+          <w:sz w:val="22"/>
+          <w:szCs w:val="22"/>
+        </w:rPr>
+        <w:t xml:space="preserve">Why this changed:</w:t>
+      </w:r>
+    </w:p>
+    <w:p/>
+    <w:p>
+      <w:r>
+        <w:rPr>
+          <w:sz w:val="22"/>
+          <w:szCs w:val="22"/>
+        </w:rPr>
+        <w:t xml:space="preserve">- the workspace now has a real `.git` directory</w:t>
+      </w:r>
+    </w:p>
+    <w:p>
+      <w:r>
+        <w:rPr>
+          <w:sz w:val="22"/>
+          <w:szCs w:val="22"/>
+        </w:rPr>
+        <w:t xml:space="preserve">- the local `.expo/` cache folder was removed</w:t>
+      </w:r>
+    </w:p>
+    <w:p>
+      <w:r>
+        <w:rPr>
+          <w:sz w:val="22"/>
+          <w:szCs w:val="22"/>
+        </w:rPr>
+        <w:t xml:space="preserve">- the generated local `android/` folder was removed after the native smoke pass</w:t>
       </w:r>
     </w:p>
     <w:p/>
@@ -1762,6 +1819,15 @@
           <w:sz w:val="22"/>
           <w:szCs w:val="22"/>
         </w:rPr>
+        <w:t xml:space="preserve">- `npx expo-doctor`</w:t>
+      </w:r>
+    </w:p>
+    <w:p>
+      <w:r>
+        <w:rPr>
+          <w:sz w:val="22"/>
+          <w:szCs w:val="22"/>
+        </w:rPr>
         <w:t xml:space="preserve">- `npx expo start`</w:t>
       </w:r>
     </w:p>
@@ -1843,6 +1909,15 @@
         <w:t xml:space="preserve">- `npm audit --json`</w:t>
       </w:r>
     </w:p>
+    <w:p>
+      <w:r>
+        <w:rPr>
+          <w:sz w:val="22"/>
+          <w:szCs w:val="22"/>
+        </w:rPr>
+        <w:t xml:space="preserve">- `npx expo-doctor`</w:t>
+      </w:r>
+    </w:p>
     <w:p/>
     <w:p>
       <w:r>
@@ -1861,6 +1936,26 @@
           <w:szCs w:val="22"/>
         </w:rPr>
         <w:t xml:space="preserve">- `0` vulnerabilities</w:t>
+      </w:r>
+    </w:p>
+    <w:p/>
+    <w:p>
+      <w:r>
+        <w:rPr>
+          <w:sz w:val="22"/>
+          <w:szCs w:val="22"/>
+        </w:rPr>
+        <w:t xml:space="preserve">`npx expo-doctor` reported:</w:t>
+      </w:r>
+    </w:p>
+    <w:p/>
+    <w:p>
+      <w:r>
+        <w:rPr>
+          <w:sz w:val="22"/>
+          <w:szCs w:val="22"/>
+        </w:rPr>
+        <w:t xml:space="preserve">- `17/17` checks passed</w:t>
       </w:r>
     </w:p>
     <w:p/>
@@ -2869,7 +2964,7 @@
           <w:sz w:val="22"/>
           <w:szCs w:val="22"/>
         </w:rPr>
-        <w:t xml:space="preserve">2. Confirm whether this local workspace should keep using the generated `android/` folder or whether it should return to a no-native-folder managed workflow.</w:t>
+        <w:t xml:space="preserve">2. Assume the workspace should stay in the no-local-native-folder managed workflow unless you intentionally need a fresh native debug build.</w:t>
       </w:r>
     </w:p>
     <w:p>
@@ -3108,16 +3203,25 @@
           <w:sz w:val="22"/>
           <w:szCs w:val="22"/>
         </w:rPr>
-        <w:t xml:space="preserve">- The local `android/` folder currently exists because of the 2026-03-27 native smoke test.</w:t>
-      </w:r>
-    </w:p>
-    <w:p>
-      <w:r>
-        <w:rPr>
-          <w:sz w:val="22"/>
-          <w:szCs w:val="22"/>
-        </w:rPr>
-        <w:t xml:space="preserve">- With `android/` present locally, remember the `expo-doctor` warning about config sync expectations.</w:t>
+        <w:t xml:space="preserve">- The repo is now connected to GitHub at `https://github.com/moonlithe1983/sideroom`.</w:t>
+      </w:r>
+    </w:p>
+    <w:p>
+      <w:r>
+        <w:rPr>
+          <w:sz w:val="22"/>
+          <w:szCs w:val="22"/>
+        </w:rPr>
+        <w:t xml:space="preserve">- The local `android/` folder does **not** currently exist because it was removed after the native smoke test cleanup.</w:t>
+      </w:r>
+    </w:p>
+    <w:p>
+      <w:r>
+        <w:rPr>
+          <w:sz w:val="22"/>
+          <w:szCs w:val="22"/>
+        </w:rPr>
+        <w:t xml:space="preserve">- If you recreate `android/` with `npx expo run:android`, keep it out of Git and remove it again when you are done if you want the repo to stay in the clean managed state.</w:t>
       </w:r>
     </w:p>
     <w:p>
@@ -3297,6 +3401,15 @@
           <w:szCs w:val="22"/>
         </w:rPr>
         <w:t xml:space="preserve">- the app has passed a real native Android emulator smoke boot into the missing-config gate</w:t>
+      </w:r>
+    </w:p>
+    <w:p>
+      <w:r>
+        <w:rPr>
+          <w:sz w:val="22"/>
+          <w:szCs w:val="22"/>
+        </w:rPr>
+        <w:t xml:space="preserve">- the workspace has been cleaned back to the managed / GitHub-friendly state and `expo-doctor` now passes cleanly</w:t>
       </w:r>
     </w:p>
     <w:p>

</xml_diff>

<commit_message>
Finalize GitHub readiness and account deletion flow
</commit_message>
<xml_diff>
--- a/PROJECT_HANDOFF_2026-03-27.docx
+++ b/PROJECT_HANDOFF_2026-03-27.docx
@@ -78,7 +78,7 @@
           <w:sz w:val="22"/>
           <w:szCs w:val="22"/>
         </w:rPr>
-        <w:t xml:space="preserve">- dependency security issues were remediated until `npm audit --json` returned `0` vulnerabilities</w:t>
+        <w:t xml:space="preserve">- dependency security issues were remediated until the local audit returned `0` vulnerabilities</w:t>
       </w:r>
     </w:p>
     <w:p>
@@ -96,7 +96,7 @@
           <w:sz w:val="22"/>
           <w:szCs w:val="22"/>
         </w:rPr>
-        <w:t xml:space="preserve">- the app was smoke-tested in that native Android environment</w:t>
+        <w:t xml:space="preserve">- the app was smoke-tested repeatedly in that native Android environment</w:t>
       </w:r>
     </w:p>
     <w:p>
@@ -114,7 +114,7 @@
           <w:sz w:val="22"/>
           <w:szCs w:val="22"/>
         </w:rPr>
-        <w:t xml:space="preserve">- the workspace was then cleaned back to the managed / no-local-native-folder state so GitHub and `expo-doctor` stay clean</w:t>
+        <w:t xml:space="preserve">- the latest smoke pass recreated a local `android/` folder, and that folder remains ignored by Git</w:t>
       </w:r>
     </w:p>
     <w:p>
@@ -124,6 +124,24 @@
           <w:szCs w:val="22"/>
         </w:rPr>
         <w:t xml:space="preserve">- the local repo is now connected to GitHub at `https://github.com/moonlithe1983/sideroom`</w:t>
+      </w:r>
+    </w:p>
+    <w:p>
+      <w:r>
+        <w:rPr>
+          <w:sz w:val="22"/>
+          <w:szCs w:val="22"/>
+        </w:rPr>
+        <w:t xml:space="preserve">- GitHub Actions validation and dependency-review workflows were added for pull requests</w:t>
+      </w:r>
+    </w:p>
+    <w:p>
+      <w:r>
+        <w:rPr>
+          <w:sz w:val="22"/>
+          <w:szCs w:val="22"/>
+        </w:rPr>
+        <w:t xml:space="preserve">- a self-serve account deletion path was added for normal member accounts, backed by a new Supabase migration</w:t>
       </w:r>
     </w:p>
     <w:p/>
@@ -264,6 +282,15 @@
           <w:sz w:val="22"/>
           <w:szCs w:val="22"/>
         </w:rPr>
+        <w:t xml:space="preserve">- Self-serve account deletion for non-staff accounts from the Me tab.</w:t>
+      </w:r>
+    </w:p>
+    <w:p>
+      <w:r>
+        <w:rPr>
+          <w:sz w:val="22"/>
+          <w:szCs w:val="22"/>
+        </w:rPr>
         <w:t xml:space="preserve">- Author controls to mark a post `resolved` or reopen it.</w:t>
       </w:r>
     </w:p>
@@ -393,7 +420,7 @@
           <w:sz w:val="22"/>
           <w:szCs w:val="22"/>
         </w:rPr>
-        <w:t xml:space="preserve">- Performed a native Android emulator smoke test using `expo run:android`.</w:t>
+        <w:t xml:space="preserve">- Performed repeated native Android emulator smoke tests using `expo run:android`.</w:t>
       </w:r>
     </w:p>
     <w:p>
@@ -411,7 +438,7 @@
           <w:sz w:val="22"/>
           <w:szCs w:val="22"/>
         </w:rPr>
-        <w:t xml:space="preserve">- Removed the generated local `android/` and `.expo/` folders afterward so the tracked repo stays in a clean managed state.</w:t>
+        <w:t xml:space="preserve">- The latest smoke pass left the generated local `android/` folder in place, and it remains ignored by Git.</w:t>
       </w:r>
     </w:p>
     <w:p>
@@ -421,6 +448,24 @@
           <w:szCs w:val="22"/>
         </w:rPr>
         <w:t xml:space="preserve">- Initialized the local Git repository, connected `origin`, and pushed `main` to GitHub.</w:t>
+      </w:r>
+    </w:p>
+    <w:p>
+      <w:r>
+        <w:rPr>
+          <w:sz w:val="22"/>
+          <w:szCs w:val="22"/>
+        </w:rPr>
+        <w:t xml:space="preserve">- Added GitHub Actions workflows for validation and dependency review.</w:t>
+      </w:r>
+    </w:p>
+    <w:p>
+      <w:r>
+        <w:rPr>
+          <w:sz w:val="22"/>
+          <w:szCs w:val="22"/>
+        </w:rPr>
+        <w:t xml:space="preserve">- Added an account-deletion migration plus client/UI support for non-staff self-serve deletion.</w:t>
       </w:r>
     </w:p>
     <w:p/>
@@ -504,7 +549,7 @@
           <w:sz w:val="22"/>
           <w:szCs w:val="22"/>
         </w:rPr>
-        <w:t xml:space="preserve">- Dependency hardening completed until `npm audit --json` reported `0` vulnerabilities.</w:t>
+        <w:t xml:space="preserve">- Dependency hardening completed until `npm run audit:check` reported `0` vulnerabilities.</w:t>
       </w:r>
     </w:p>
     <w:p/>
@@ -1236,6 +1281,24 @@
         <w:t xml:space="preserve">   - Author-controlled post resolution and server-enforced locked-post reply protection.</w:t>
       </w:r>
     </w:p>
+    <w:p>
+      <w:r>
+        <w:rPr>
+          <w:sz w:val="22"/>
+          <w:szCs w:val="22"/>
+        </w:rPr>
+        <w:t xml:space="preserve">8. `supabase/migrations/20260327_000008_account_deletion.sql`</w:t>
+      </w:r>
+    </w:p>
+    <w:p>
+      <w:r>
+        <w:rPr>
+          <w:sz w:val="22"/>
+          <w:szCs w:val="22"/>
+        </w:rPr>
+        <w:t xml:space="preserve">   - Self-serve account deletion for non-staff accounts.</w:t>
+      </w:r>
+    </w:p>
     <w:p/>
     <w:p>
       <w:r>
@@ -1572,25 +1635,25 @@
           <w:sz w:val="22"/>
           <w:szCs w:val="22"/>
         </w:rPr>
-        <w:t xml:space="preserve">- That folder was intentionally removed after the smoke pass.</w:t>
-      </w:r>
-    </w:p>
-    <w:p>
-      <w:r>
-        <w:rPr>
-          <w:sz w:val="22"/>
-          <w:szCs w:val="22"/>
-        </w:rPr>
-        <w:t xml:space="preserve">- The workspace is currently back in the managed / no-local-native-folder state.</w:t>
-      </w:r>
-    </w:p>
-    <w:p>
-      <w:r>
-        <w:rPr>
-          <w:sz w:val="22"/>
-          <w:szCs w:val="22"/>
-        </w:rPr>
-        <w:t xml:space="preserve">- If native local debugging is needed again, rerun `npx expo run:android` and expect Expo to recreate `android/` locally.</w:t>
+        <w:t xml:space="preserve">- The latest smoke pass recreated that folder and it is still present locally right now.</w:t>
+      </w:r>
+    </w:p>
+    <w:p>
+      <w:r>
+        <w:rPr>
+          <w:sz w:val="22"/>
+          <w:szCs w:val="22"/>
+        </w:rPr>
+        <w:t xml:space="preserve">- The folder is ignored by Git and should not be committed.</w:t>
+      </w:r>
+    </w:p>
+    <w:p>
+      <w:r>
+        <w:rPr>
+          <w:sz w:val="22"/>
+          <w:szCs w:val="22"/>
+        </w:rPr>
+        <w:t xml:space="preserve">- If you want the workspace back in the managed-only shape later, you can remove `android/` after native local debugging is finished.</w:t>
       </w:r>
     </w:p>
     <w:p/>
@@ -1629,16 +1692,16 @@
           <w:sz w:val="22"/>
           <w:szCs w:val="22"/>
         </w:rPr>
-        <w:t xml:space="preserve">That APK path is only available immediately after a local native build. It is not retained in the</w:t>
-      </w:r>
-    </w:p>
-    <w:p>
-      <w:r>
-        <w:rPr>
-          <w:sz w:val="22"/>
-          <w:szCs w:val="22"/>
-        </w:rPr>
-        <w:t xml:space="preserve">current cleaned workspace.</w:t>
+        <w:t xml:space="preserve">That APK path is available after a local native build and was present in the workspace after the</w:t>
+      </w:r>
+    </w:p>
+    <w:p>
+      <w:r>
+        <w:rPr>
+          <w:sz w:val="22"/>
+          <w:szCs w:val="22"/>
+        </w:rPr>
+        <w:t xml:space="preserve">latest smoke pass.</w:t>
       </w:r>
     </w:p>
     <w:p/>
@@ -1659,7 +1722,7 @@
           <w:sz w:val="22"/>
           <w:szCs w:val="22"/>
         </w:rPr>
-        <w:t xml:space="preserve">`npx expo-doctor` now passes cleanly:</w:t>
+        <w:t xml:space="preserve">`npm run doctor` now passes cleanly:</w:t>
       </w:r>
     </w:p>
     <w:p/>
@@ -1679,35 +1742,16 @@
           <w:sz w:val="22"/>
           <w:szCs w:val="22"/>
         </w:rPr>
-        <w:t xml:space="preserve">Why this changed:</w:t>
-      </w:r>
-    </w:p>
-    <w:p/>
-    <w:p>
-      <w:r>
-        <w:rPr>
-          <w:sz w:val="22"/>
-          <w:szCs w:val="22"/>
-        </w:rPr>
-        <w:t xml:space="preserve">- the workspace now has a real `.git` directory</w:t>
-      </w:r>
-    </w:p>
-    <w:p>
-      <w:r>
-        <w:rPr>
-          <w:sz w:val="22"/>
-          <w:szCs w:val="22"/>
-        </w:rPr>
-        <w:t xml:space="preserve">- the local `.expo/` cache folder was removed</w:t>
-      </w:r>
-    </w:p>
-    <w:p>
-      <w:r>
-        <w:rPr>
-          <w:sz w:val="22"/>
-          <w:szCs w:val="22"/>
-        </w:rPr>
-        <w:t xml:space="preserve">- the generated local `android/` folder was removed after the native smoke pass</w:t>
+        <w:t xml:space="preserve">This currently passes even with the locally generated `android/` folder present because that folder</w:t>
+      </w:r>
+    </w:p>
+    <w:p>
+      <w:r>
+        <w:rPr>
+          <w:sz w:val="22"/>
+          <w:szCs w:val="22"/>
+        </w:rPr>
+        <w:t xml:space="preserve">is ignored by Git and the repo metadata is otherwise healthy.</w:t>
       </w:r>
     </w:p>
     <w:p/>
@@ -1792,7 +1836,7 @@
           <w:sz w:val="22"/>
           <w:szCs w:val="22"/>
         </w:rPr>
-        <w:t xml:space="preserve">- `npx tsc --noEmit`</w:t>
+        <w:t xml:space="preserve">- `npm run typecheck`</w:t>
       </w:r>
     </w:p>
     <w:p>
@@ -1810,16 +1854,16 @@
           <w:sz w:val="22"/>
           <w:szCs w:val="22"/>
         </w:rPr>
-        <w:t xml:space="preserve">- `npm audit --json`</w:t>
-      </w:r>
-    </w:p>
-    <w:p>
-      <w:r>
-        <w:rPr>
-          <w:sz w:val="22"/>
-          <w:szCs w:val="22"/>
-        </w:rPr>
-        <w:t xml:space="preserve">- `npx expo-doctor`</w:t>
+        <w:t xml:space="preserve">- `npm run audit:check`</w:t>
+      </w:r>
+    </w:p>
+    <w:p>
+      <w:r>
+        <w:rPr>
+          <w:sz w:val="22"/>
+          <w:szCs w:val="22"/>
+        </w:rPr>
+        <w:t xml:space="preserve">- `npm run doctor`</w:t>
       </w:r>
     </w:p>
     <w:p>
@@ -1829,6 +1873,53 @@
           <w:szCs w:val="22"/>
         </w:rPr>
         <w:t xml:space="preserve">- `npx expo start`</w:t>
+      </w:r>
+    </w:p>
+    <w:p/>
+    <w:p>
+      <w:r>
+        <w:rPr>
+          <w:sz w:val="22"/>
+          <w:szCs w:val="22"/>
+        </w:rPr>
+        <w:t xml:space="preserve">GitHub workflows now mirror the main repo checks on pull requests:</w:t>
+      </w:r>
+    </w:p>
+    <w:p/>
+    <w:p>
+      <w:r>
+        <w:rPr>
+          <w:sz w:val="22"/>
+          <w:szCs w:val="22"/>
+        </w:rPr>
+        <w:t xml:space="preserve">- typecheck</w:t>
+      </w:r>
+    </w:p>
+    <w:p>
+      <w:r>
+        <w:rPr>
+          <w:sz w:val="22"/>
+          <w:szCs w:val="22"/>
+        </w:rPr>
+        <w:t xml:space="preserve">- lint</w:t>
+      </w:r>
+    </w:p>
+    <w:p>
+      <w:r>
+        <w:rPr>
+          <w:sz w:val="22"/>
+          <w:szCs w:val="22"/>
+        </w:rPr>
+        <w:t xml:space="preserve">- dependency audit</w:t>
+      </w:r>
+    </w:p>
+    <w:p>
+      <w:r>
+        <w:rPr>
+          <w:sz w:val="22"/>
+          <w:szCs w:val="22"/>
+        </w:rPr>
+        <w:t xml:space="preserve">- Expo Doctor</w:t>
       </w:r>
     </w:p>
     <w:p/>
@@ -1888,7 +1979,7 @@
           <w:sz w:val="22"/>
           <w:szCs w:val="22"/>
         </w:rPr>
-        <w:t xml:space="preserve">- `npx tsc --noEmit`</w:t>
+        <w:t xml:space="preserve">- `npm run typecheck`</w:t>
       </w:r>
     </w:p>
     <w:p>
@@ -1906,26 +1997,26 @@
           <w:sz w:val="22"/>
           <w:szCs w:val="22"/>
         </w:rPr>
-        <w:t xml:space="preserve">- `npm audit --json`</w:t>
-      </w:r>
-    </w:p>
-    <w:p>
-      <w:r>
-        <w:rPr>
-          <w:sz w:val="22"/>
-          <w:szCs w:val="22"/>
-        </w:rPr>
-        <w:t xml:space="preserve">- `npx expo-doctor`</w:t>
-      </w:r>
-    </w:p>
-    <w:p/>
-    <w:p>
-      <w:r>
-        <w:rPr>
-          <w:sz w:val="22"/>
-          <w:szCs w:val="22"/>
-        </w:rPr>
-        <w:t xml:space="preserve">`npm audit --json` reported:</w:t>
+        <w:t xml:space="preserve">- `npm run audit:check`</w:t>
+      </w:r>
+    </w:p>
+    <w:p>
+      <w:r>
+        <w:rPr>
+          <w:sz w:val="22"/>
+          <w:szCs w:val="22"/>
+        </w:rPr>
+        <w:t xml:space="preserve">- `npm run doctor`</w:t>
+      </w:r>
+    </w:p>
+    <w:p/>
+    <w:p>
+      <w:r>
+        <w:rPr>
+          <w:sz w:val="22"/>
+          <w:szCs w:val="22"/>
+        </w:rPr>
+        <w:t xml:space="preserve">`npm run audit:check` reported:</w:t>
       </w:r>
     </w:p>
     <w:p/>
@@ -1945,7 +2036,7 @@
           <w:sz w:val="22"/>
           <w:szCs w:val="22"/>
         </w:rPr>
-        <w:t xml:space="preserve">`npx expo-doctor` reported:</w:t>
+        <w:t xml:space="preserve">`npm run doctor` reported:</w:t>
       </w:r>
     </w:p>
     <w:p/>
@@ -2180,6 +2271,15 @@
           <w:szCs w:val="22"/>
         </w:rPr>
         <w:t xml:space="preserve">  - the missing variable names</w:t>
+      </w:r>
+    </w:p>
+    <w:p>
+      <w:r>
+        <w:rPr>
+          <w:sz w:val="22"/>
+          <w:szCs w:val="22"/>
+        </w:rPr>
+        <w:t xml:space="preserve">- A dev-only Metro / Expo CLI warning banner can appear if the dev server is not still attached after install, but the app itself continues running and this did not indicate a product crash.</w:t>
       </w:r>
     </w:p>
     <w:p>
@@ -2281,6 +2381,15 @@
           <w:sz w:val="22"/>
           <w:szCs w:val="22"/>
         </w:rPr>
+        <w:t xml:space="preserve">- End-to-end validation of account deletion against the live backend.</w:t>
+      </w:r>
+    </w:p>
+    <w:p>
+      <w:r>
+        <w:rPr>
+          <w:sz w:val="22"/>
+          <w:szCs w:val="22"/>
+        </w:rPr>
         <w:t xml:space="preserve">- EAS preview builds on Android.</w:t>
       </w:r>
     </w:p>
@@ -2394,7 +2503,7 @@
           <w:sz w:val="22"/>
           <w:szCs w:val="22"/>
         </w:rPr>
-        <w:t xml:space="preserve">- The current dependency tree is locally hardened and `npm audit --json` is clean.</w:t>
+        <w:t xml:space="preserve">- The current dependency tree is locally hardened and `npm run audit:check` is clean.</w:t>
       </w:r>
     </w:p>
     <w:p/>
@@ -2490,6 +2599,15 @@
           <w:sz w:val="22"/>
           <w:szCs w:val="22"/>
         </w:rPr>
+        <w:t xml:space="preserve">- Preview/staging and production backend separation still need to be finalized operationally.</w:t>
+      </w:r>
+    </w:p>
+    <w:p>
+      <w:r>
+        <w:rPr>
+          <w:sz w:val="22"/>
+          <w:szCs w:val="22"/>
+        </w:rPr>
         <w:t xml:space="preserve">- Seeded launch content across all topics.</w:t>
       </w:r>
     </w:p>
@@ -2681,7 +2799,7 @@
           <w:sz w:val="22"/>
           <w:szCs w:val="22"/>
         </w:rPr>
-        <w:t xml:space="preserve">1. Create the live Supabase project and apply all seven migrations.</w:t>
+        <w:t xml:space="preserve">1. Create the live Supabase project and apply all eight migrations.</w:t>
       </w:r>
     </w:p>
     <w:p>
@@ -2834,61 +2952,70 @@
           <w:sz w:val="22"/>
           <w:szCs w:val="22"/>
         </w:rPr>
-        <w:t xml:space="preserve">6. Add the real env values locally, rerun `npm run release:preflight`, and clear the remaining repo-side blockers.</w:t>
-      </w:r>
-    </w:p>
-    <w:p>
-      <w:r>
-        <w:rPr>
-          <w:sz w:val="22"/>
-          <w:szCs w:val="22"/>
-        </w:rPr>
-        <w:t xml:space="preserve">7. Use `docs/preview-build-runbook.md` to generate Android preview builds with the current `com.moonlithe.sideroom` package name.</w:t>
-      </w:r>
-    </w:p>
-    <w:p>
-      <w:r>
-        <w:rPr>
-          <w:sz w:val="22"/>
-          <w:szCs w:val="22"/>
-        </w:rPr>
-        <w:t xml:space="preserve">8. Use `docs/device-smoke-checklist.md` to test auth, onboarding, posting, moderation, inbox, restrictions, trust surfaces, and the Policies and Support screen on real devices.</w:t>
-      </w:r>
-    </w:p>
-    <w:p>
-      <w:r>
-        <w:rPr>
-          <w:sz w:val="22"/>
-          <w:szCs w:val="22"/>
-        </w:rPr>
-        <w:t xml:space="preserve">9. Replace the placeholder support, privacy-policy, terms, and marketing values in `config/release-metadata.json`.</w:t>
-      </w:r>
-    </w:p>
-    <w:p>
-      <w:r>
-        <w:rPr>
-          <w:sz w:val="22"/>
-          <w:szCs w:val="22"/>
-        </w:rPr>
-        <w:t xml:space="preserve">10. Use `docs/google-play-submission-checklist.md` to prepare listing, policy, and testing-track requirements before public release.</w:t>
-      </w:r>
-    </w:p>
-    <w:p>
-      <w:r>
-        <w:rPr>
-          <w:sz w:val="22"/>
-          <w:szCs w:val="22"/>
-        </w:rPr>
-        <w:t xml:space="preserve">11. Tighten staff security with MFA, least-privilege rules, and redacted operational logging.</w:t>
-      </w:r>
-    </w:p>
-    <w:p>
-      <w:r>
-        <w:rPr>
-          <w:sz w:val="22"/>
-          <w:szCs w:val="22"/>
-        </w:rPr>
-        <w:t xml:space="preserve">12. Run a closed beta before any public store submission.</w:t>
+        <w:t xml:space="preserve">6. Keep preview/staging and production Supabase projects separate before real users arrive.</w:t>
+      </w:r>
+    </w:p>
+    <w:p>
+      <w:r>
+        <w:rPr>
+          <w:sz w:val="22"/>
+          <w:szCs w:val="22"/>
+        </w:rPr>
+        <w:t xml:space="preserve">7. Add the real env values locally, rerun `npm run release:preflight`, and clear the remaining repo-side blockers.</w:t>
+      </w:r>
+    </w:p>
+    <w:p>
+      <w:r>
+        <w:rPr>
+          <w:sz w:val="22"/>
+          <w:szCs w:val="22"/>
+        </w:rPr>
+        <w:t xml:space="preserve">8. Use `docs/preview-build-runbook.md` to generate Android preview builds with the current `com.moonlithe.sideroom` package name.</w:t>
+      </w:r>
+    </w:p>
+    <w:p>
+      <w:r>
+        <w:rPr>
+          <w:sz w:val="22"/>
+          <w:szCs w:val="22"/>
+        </w:rPr>
+        <w:t xml:space="preserve">9. Use `docs/device-smoke-checklist.md` to test auth, onboarding, posting, moderation, inbox, restrictions, trust surfaces, and the Policies and Support screen on real devices.</w:t>
+      </w:r>
+    </w:p>
+    <w:p>
+      <w:r>
+        <w:rPr>
+          <w:sz w:val="22"/>
+          <w:szCs w:val="22"/>
+        </w:rPr>
+        <w:t xml:space="preserve">10. Replace the placeholder support, privacy-policy, terms, and marketing values in `config/release-metadata.json`.</w:t>
+      </w:r>
+    </w:p>
+    <w:p>
+      <w:r>
+        <w:rPr>
+          <w:sz w:val="22"/>
+          <w:szCs w:val="22"/>
+        </w:rPr>
+        <w:t xml:space="preserve">11. Use `docs/google-play-submission-checklist.md` to prepare listing, policy, and testing-track requirements before public release.</w:t>
+      </w:r>
+    </w:p>
+    <w:p>
+      <w:r>
+        <w:rPr>
+          <w:sz w:val="22"/>
+          <w:szCs w:val="22"/>
+        </w:rPr>
+        <w:t xml:space="preserve">12. Tighten staff security with MFA, least-privilege rules, and redacted operational logging.</w:t>
+      </w:r>
+    </w:p>
+    <w:p>
+      <w:r>
+        <w:rPr>
+          <w:sz w:val="22"/>
+          <w:szCs w:val="22"/>
+        </w:rPr>
+        <w:t xml:space="preserve">13. Run a closed beta before any public store submission.</w:t>
       </w:r>
     </w:p>
     <w:p/>
@@ -2964,7 +3091,7 @@
           <w:sz w:val="22"/>
           <w:szCs w:val="22"/>
         </w:rPr>
-        <w:t xml:space="preserve">2. Assume the workspace should stay in the no-local-native-folder managed workflow unless you intentionally need a fresh native debug build.</w:t>
+        <w:t xml:space="preserve">2. Assume the workspace should keep local native debug artifacts out of Git, even if `android/` exists locally after smoke testing.</w:t>
       </w:r>
     </w:p>
     <w:p>
@@ -2982,7 +3109,7 @@
           <w:sz w:val="22"/>
           <w:szCs w:val="22"/>
         </w:rPr>
-        <w:t xml:space="preserve">4. Create or inspect the Supabase project and verify all seven migrations are applied in order.</w:t>
+        <w:t xml:space="preserve">4. Create or inspect the Supabase project and verify all eight migrations are applied in order.</w:t>
       </w:r>
     </w:p>
     <w:p>
@@ -3000,7 +3127,7 @@
           <w:sz w:val="22"/>
           <w:szCs w:val="22"/>
         </w:rPr>
-        <w:t xml:space="preserve">   - `npx tsc --noEmit`</w:t>
+        <w:t xml:space="preserve">   - `npm run typecheck`</w:t>
       </w:r>
     </w:p>
     <w:p>
@@ -3018,7 +3145,16 @@
           <w:sz w:val="22"/>
           <w:szCs w:val="22"/>
         </w:rPr>
-        <w:t xml:space="preserve">   - `npm audit --json`</w:t>
+        <w:t xml:space="preserve">   - `npm run audit:check`</w:t>
+      </w:r>
+    </w:p>
+    <w:p>
+      <w:r>
+        <w:rPr>
+          <w:sz w:val="22"/>
+          <w:szCs w:val="22"/>
+        </w:rPr>
+        <w:t xml:space="preserve">   - `npm run doctor`</w:t>
       </w:r>
     </w:p>
     <w:p>
@@ -3100,7 +3236,7 @@
           <w:sz w:val="22"/>
           <w:szCs w:val="22"/>
         </w:rPr>
-        <w:t xml:space="preserve">of manually copying seven separate files.</w:t>
+        <w:t xml:space="preserve">of manually copying eight separate files.</w:t>
       </w:r>
     </w:p>
     <w:p/>
@@ -3212,16 +3348,16 @@
           <w:sz w:val="22"/>
           <w:szCs w:val="22"/>
         </w:rPr>
-        <w:t xml:space="preserve">- The local `android/` folder does **not** currently exist because it was removed after the native smoke test cleanup.</w:t>
-      </w:r>
-    </w:p>
-    <w:p>
-      <w:r>
-        <w:rPr>
-          <w:sz w:val="22"/>
-          <w:szCs w:val="22"/>
-        </w:rPr>
-        <w:t xml:space="preserve">- If you recreate `android/` with `npx expo run:android`, keep it out of Git and remove it again when you are done if you want the repo to stay in the clean managed state.</w:t>
+        <w:t xml:space="preserve">- The local `android/` folder currently exists from the latest native smoke pass and is ignored by Git.</w:t>
+      </w:r>
+    </w:p>
+    <w:p>
+      <w:r>
+        <w:rPr>
+          <w:sz w:val="22"/>
+          <w:szCs w:val="22"/>
+        </w:rPr>
+        <w:t xml:space="preserve">- If you later remove and recreate `android/` with `npx expo run:android`, keep it out of Git and remove it again when you want the workspace back in the clean managed state.</w:t>
       </w:r>
     </w:p>
     <w:p>
@@ -3409,7 +3545,7 @@
           <w:sz w:val="22"/>
           <w:szCs w:val="22"/>
         </w:rPr>
-        <w:t xml:space="preserve">- the workspace has been cleaned back to the managed / GitHub-friendly state and `expo-doctor` now passes cleanly</w:t>
+        <w:t xml:space="preserve">- the repo remains GitHub-clean even though the latest local smoke pass recreated an ignored `android/` folder, and `npm run doctor` still passes cleanly</w:t>
       </w:r>
     </w:p>
     <w:p>

</xml_diff>